<commit_message>
Reordered layout, clarified buttons, edited template docx
</commit_message>
<xml_diff>
--- a/Testing/School Attendance Parent letter.ver 3.docx
+++ b/Testing/School Attendance Parent letter.ver 3.docx
@@ -1,6 +1,6 @@
 
 <file path=word/document.xml><?xml version="1.0" encoding="utf-8"?>
-<w:document xmlns:wpc="http://schemas.microsoft.com/office/word/2010/wordprocessingCanvas" xmlns:cx="http://schemas.microsoft.com/office/drawing/2014/chartex" xmlns:cx1="http://schemas.microsoft.com/office/drawing/2015/9/8/chartex" xmlns:cx2="http://schemas.microsoft.com/office/drawing/2015/10/21/chartex" xmlns:cx3="http://schemas.microsoft.com/office/drawing/2016/5/9/chartex" xmlns:cx4="http://schemas.microsoft.com/office/drawing/2016/5/10/chartex" xmlns:cx5="http://schemas.microsoft.com/office/drawing/2016/5/11/chartex" xmlns:cx6="http://schemas.microsoft.com/office/drawing/2016/5/12/chartex" xmlns:cx7="http://schemas.microsoft.com/office/drawing/2016/5/13/chartex" xmlns:cx8="http://schemas.microsoft.com/office/drawing/2016/5/14/chartex" xmlns:mc="http://schemas.openxmlformats.org/markup-compatibility/2006" xmlns:aink="http://schemas.microsoft.com/office/drawing/2016/ink" xmlns:am3d="http://schemas.microsoft.com/office/drawing/2017/model3d" xmlns:o="urn:schemas-microsoft-com:office:office" xmlns:oel="http://schemas.microsoft.com/office/2019/extlst" xmlns:r="http://schemas.openxmlformats.org/officeDocument/2006/relationships" xmlns:m="http://schemas.openxmlformats.org/officeDocument/2006/math" xmlns:v="urn:schemas-microsoft-com:vml" xmlns:wp14="http://schemas.microsoft.com/office/word/2010/wordprocessingDrawing" xmlns:wp="http://schemas.openxmlformats.org/drawingml/2006/wordprocessingDrawing" xmlns:w10="urn:schemas-microsoft-com:office:word" xmlns:w="http://schemas.openxmlformats.org/wordprocessingml/2006/main" xmlns:w14="http://schemas.microsoft.com/office/word/2010/wordml" xmlns:w15="http://schemas.microsoft.com/office/word/2012/wordml" xmlns:w16cex="http://schemas.microsoft.com/office/word/2018/wordml/cex" xmlns:w16cid="http://schemas.microsoft.com/office/word/2016/wordml/cid" xmlns:w16="http://schemas.microsoft.com/office/word/2018/wordml" xmlns:w16sdtdh="http://schemas.microsoft.com/office/word/2020/wordml/sdtdatahash" xmlns:w16se="http://schemas.microsoft.com/office/word/2015/wordml/symex" xmlns:wpg="http://schemas.microsoft.com/office/word/2010/wordprocessingGroup" xmlns:wpi="http://schemas.microsoft.com/office/word/2010/wordprocessingInk" xmlns:wne="http://schemas.microsoft.com/office/word/2006/wordml" xmlns:wps="http://schemas.microsoft.com/office/word/2010/wordprocessingShape" mc:Ignorable="w14 w15 w16se w16cid w16 w16cex w16sdtdh wp14">
+<w:document xmlns:wpc="http://schemas.microsoft.com/office/word/2010/wordprocessingCanvas" xmlns:cx="http://schemas.microsoft.com/office/drawing/2014/chartex" xmlns:cx1="http://schemas.microsoft.com/office/drawing/2015/9/8/chartex" xmlns:cx2="http://schemas.microsoft.com/office/drawing/2015/10/21/chartex" xmlns:cx3="http://schemas.microsoft.com/office/drawing/2016/5/9/chartex" xmlns:cx4="http://schemas.microsoft.com/office/drawing/2016/5/10/chartex" xmlns:cx5="http://schemas.microsoft.com/office/drawing/2016/5/11/chartex" xmlns:cx6="http://schemas.microsoft.com/office/drawing/2016/5/12/chartex" xmlns:cx7="http://schemas.microsoft.com/office/drawing/2016/5/13/chartex" xmlns:cx8="http://schemas.microsoft.com/office/drawing/2016/5/14/chartex" xmlns:mc="http://schemas.openxmlformats.org/markup-compatibility/2006" xmlns:aink="http://schemas.microsoft.com/office/drawing/2016/ink" xmlns:am3d="http://schemas.microsoft.com/office/drawing/2017/model3d" xmlns:o="urn:schemas-microsoft-com:office:office" xmlns:oel="http://schemas.microsoft.com/office/2019/extlst" xmlns:r="http://schemas.openxmlformats.org/officeDocument/2006/relationships" xmlns:m="http://schemas.openxmlformats.org/officeDocument/2006/math" xmlns:v="urn:schemas-microsoft-com:vml" xmlns:wp14="http://schemas.microsoft.com/office/word/2010/wordprocessingDrawing" xmlns:wp="http://schemas.openxmlformats.org/drawingml/2006/wordprocessingDrawing" xmlns:w10="urn:schemas-microsoft-com:office:word" xmlns:w="http://schemas.openxmlformats.org/wordprocessingml/2006/main" xmlns:w14="http://schemas.microsoft.com/office/word/2010/wordml" xmlns:w15="http://schemas.microsoft.com/office/word/2012/wordml" xmlns:w16cex="http://schemas.microsoft.com/office/word/2018/wordml/cex" xmlns:w16cid="http://schemas.microsoft.com/office/word/2016/wordml/cid" xmlns:w16="http://schemas.microsoft.com/office/word/2018/wordml" xmlns:w16du="http://schemas.microsoft.com/office/word/2023/wordml/word16du" xmlns:w16sdtdh="http://schemas.microsoft.com/office/word/2020/wordml/sdtdatahash" xmlns:w16sdtfl="http://schemas.microsoft.com/office/word/2024/wordml/sdtformatlock" xmlns:w16se="http://schemas.microsoft.com/office/word/2015/wordml/symex" xmlns:wpg="http://schemas.microsoft.com/office/word/2010/wordprocessingGroup" xmlns:wpi="http://schemas.microsoft.com/office/word/2010/wordprocessingInk" xmlns:wne="http://schemas.microsoft.com/office/word/2006/wordml" xmlns:wps="http://schemas.microsoft.com/office/word/2010/wordprocessingShape" mc:Ignorable="w14 w15 w16se w16cid w16 w16cex w16sdtdh w16sdtfl w16du wp14">
   <w:body>
     <w:p>
       <w:pPr>
@@ -236,7 +236,7 @@
           <w:b/>
           <w:bCs/>
         </w:rPr>
-        <w:t>PARENT NAME</w:t>
+        <w:t>{{ parent_name }}</w:t>
       </w:r>
       <w:r>
         <w:rPr>
@@ -288,7 +288,6 @@
         </w:rPr>
         <w:t xml:space="preserve"> </w:t>
       </w:r>
-      <w:proofErr w:type="gramStart"/>
       <w:r>
         <w:rPr>
           <w:rFonts w:ascii="Arial" w:hAnsi="Arial" w:cs="Arial"/>
@@ -305,25 +304,14 @@
         </w:rPr>
         <w:t xml:space="preserve"> </w:t>
       </w:r>
-      <w:proofErr w:type="spellStart"/>
-      <w:r>
-        <w:rPr>
-          <w:rFonts w:ascii="Arial" w:hAnsi="Arial" w:cs="Arial"/>
-          <w:b/>
-          <w:bCs/>
-        </w:rPr>
-        <w:t>youth</w:t>
-      </w:r>
-      <w:proofErr w:type="gramEnd"/>
-      <w:r>
-        <w:rPr>
-          <w:rFonts w:ascii="Arial" w:hAnsi="Arial" w:cs="Arial"/>
-          <w:b/>
-          <w:bCs/>
-        </w:rPr>
-        <w:t>_name</w:t>
-      </w:r>
-      <w:proofErr w:type="spellEnd"/>
+      <w:r>
+        <w:rPr>
+          <w:rFonts w:ascii="Arial" w:hAnsi="Arial" w:cs="Arial"/>
+          <w:b/>
+          <w:bCs/>
+        </w:rPr>
+        <w:t>youth_name</w:t>
+      </w:r>
       <w:r>
         <w:rPr>
           <w:rFonts w:ascii="Arial" w:hAnsi="Arial" w:cs="Arial"/>
@@ -440,23 +428,7 @@
           <w:b/>
           <w:bCs/>
         </w:rPr>
-        <w:t xml:space="preserve">Friday, </w:t>
-      </w:r>
-      <w:r>
-        <w:rPr>
-          <w:rFonts w:ascii="Arial" w:hAnsi="Arial" w:cs="Arial"/>
-          <w:b/>
-          <w:bCs/>
-        </w:rPr>
-        <w:t>April 1</w:t>
-      </w:r>
-      <w:r>
-        <w:rPr>
-          <w:rFonts w:ascii="Arial" w:hAnsi="Arial" w:cs="Arial"/>
-          <w:b/>
-          <w:bCs/>
-        </w:rPr>
-        <w:t>7</w:t>
+        <w:t>##</w:t>
       </w:r>
       <w:r>
         <w:rPr>
@@ -466,24 +438,14 @@
         </w:rPr>
         <w:t xml:space="preserve">, </w:t>
       </w:r>
-      <w:proofErr w:type="gramStart"/>
-      <w:r>
-        <w:rPr>
-          <w:rFonts w:ascii="Arial" w:hAnsi="Arial" w:cs="Arial"/>
-          <w:b/>
-          <w:bCs/>
-        </w:rPr>
-        <w:t>202</w:t>
-      </w:r>
-      <w:r>
-        <w:rPr>
-          <w:rFonts w:ascii="Arial" w:hAnsi="Arial" w:cs="Arial"/>
-          <w:b/>
-          <w:bCs/>
-        </w:rPr>
-        <w:t>6</w:t>
-      </w:r>
-      <w:proofErr w:type="gramEnd"/>
+      <w:r>
+        <w:rPr>
+          <w:rFonts w:ascii="Arial" w:hAnsi="Arial" w:cs="Arial"/>
+          <w:b/>
+          <w:bCs/>
+        </w:rPr>
+        <w:t>## ##, ####</w:t>
+      </w:r>
       <w:r>
         <w:rPr>
           <w:rFonts w:ascii="Arial" w:hAnsi="Arial" w:cs="Arial"/>
@@ -530,6 +492,14 @@
           <w:b/>
           <w:bCs/>
         </w:rPr>
+        <w:tab/>
+      </w:r>
+      <w:r>
+        <w:rPr>
+          <w:rFonts w:ascii="Arial" w:hAnsi="Arial" w:cs="Arial"/>
+          <w:b/>
+          <w:bCs/>
+        </w:rPr>
         <w:t>Time:</w:t>
       </w:r>
       <w:r>
@@ -546,7 +516,23 @@
           <w:b/>
           <w:bCs/>
         </w:rPr>
-        <w:t>10:00A</w:t>
+        <w:t>##</w:t>
+      </w:r>
+      <w:r>
+        <w:rPr>
+          <w:rFonts w:ascii="Arial" w:hAnsi="Arial" w:cs="Arial"/>
+          <w:b/>
+          <w:bCs/>
+        </w:rPr>
+        <w:t>:</w:t>
+      </w:r>
+      <w:r>
+        <w:rPr>
+          <w:rFonts w:ascii="Arial" w:hAnsi="Arial" w:cs="Arial"/>
+          <w:b/>
+          <w:bCs/>
+        </w:rPr>
+        <w:t>##?</w:t>
       </w:r>
       <w:r>
         <w:rPr>
@@ -663,29 +649,25 @@
                 <w:p>
                   <w:pPr>
                     <w:rPr>
-                      <w:rFonts w:ascii="Aptos Narrow" w:eastAsia="Times New Roman" w:hAnsi="Aptos Narrow" w:cs="Times New Roman"/>
-                      <w:color w:val="467886"/>
-                      <w:kern w:val="0"/>
+                      <w:rFonts w:ascii="Aptos Narrow" w:hAnsi="Aptos Narrow"/>
+                    </w:rPr>
+                  </w:pPr>
+                  <w:r>
+                    <w:rPr>
+                      <w:rFonts w:ascii="Aptos Narrow" w:hAnsi="Aptos Narrow"/>
                       <w:sz w:val="22"/>
                       <w:szCs w:val="22"/>
-                      <w:u w:val="single"/>
-                      <w14:ligatures w14:val="none"/>
                     </w:rPr>
-                  </w:pPr>
-                  <w:hyperlink r:id="rId9" w:history="1">
-                    <w:r>
-                      <w:rPr>
-                        <w:rFonts w:ascii="Aptos Narrow" w:eastAsia="Times New Roman" w:hAnsi="Aptos Narrow" w:cs="Times New Roman"/>
-                        <w:color w:val="467886"/>
-                        <w:kern w:val="0"/>
-                        <w:sz w:val="22"/>
-                        <w:szCs w:val="22"/>
-                        <w:u w:val="single"/>
-                        <w14:ligatures w14:val="none"/>
-                      </w:rPr>
-                      <w:t>https://us06web.zoom.us/j/83109714577?pwd=ymIAe0XBxZonKneuUiq9Wl51GROWbl.1</w:t>
-                    </w:r>
-                  </w:hyperlink>
+                    <w:t>https://us06web.zoom.us/j/</w:t>
+                  </w:r>
+                  <w:r>
+                    <w:rPr>
+                      <w:rFonts w:ascii="Aptos Narrow" w:hAnsi="Aptos Narrow"/>
+                      <w:sz w:val="22"/>
+                      <w:szCs w:val="22"/>
+                    </w:rPr>
+                    <w:t>.....</w:t>
+                  </w:r>
                 </w:p>
               </w:tc>
             </w:tr>
@@ -1339,7 +1321,7 @@
               </wp:anchor>
             </w:drawing>
           </mc:Choice>
-          <mc:Fallback xmlns:w16sdtfl="http://schemas.microsoft.com/office/word/2024/wordml/sdtformatlock" xmlns:w16du="http://schemas.microsoft.com/office/word/2023/wordml/word16du">
+          <mc:Fallback>
             <w:pict>
               <v:shapetype w14:anchorId="348A31A1" id="_x0000_t202" coordsize="21600,21600" o:spt="202" path="m,l,21600r21600,l21600,xe">
                 <v:stroke joinstyle="miter"/>
@@ -1465,12 +1447,12 @@
       </w:r>
     </w:p>
     <w:sectPr>
-      <w:headerReference w:type="even" r:id="rId10"/>
-      <w:headerReference w:type="default" r:id="rId11"/>
-      <w:footerReference w:type="even" r:id="rId12"/>
-      <w:footerReference w:type="default" r:id="rId13"/>
-      <w:headerReference w:type="first" r:id="rId14"/>
-      <w:footerReference w:type="first" r:id="rId15"/>
+      <w:headerReference w:type="even" r:id="rId9"/>
+      <w:headerReference w:type="default" r:id="rId10"/>
+      <w:footerReference w:type="even" r:id="rId11"/>
+      <w:footerReference w:type="default" r:id="rId12"/>
+      <w:headerReference w:type="first" r:id="rId13"/>
+      <w:footerReference w:type="first" r:id="rId14"/>
       <w:pgSz w:w="12240" w:h="15840"/>
       <w:pgMar w:top="1440" w:right="1440" w:bottom="1440" w:left="1440" w:header="720" w:footer="720" w:gutter="0"/>
       <w:cols w:space="720"/>
@@ -1481,7 +1463,7 @@
 </file>
 
 <file path=word/endnotes.xml><?xml version="1.0" encoding="utf-8"?>
-<w:endnotes xmlns:wpc="http://schemas.microsoft.com/office/word/2010/wordprocessingCanvas" xmlns:cx="http://schemas.microsoft.com/office/drawing/2014/chartex" xmlns:cx1="http://schemas.microsoft.com/office/drawing/2015/9/8/chartex" xmlns:cx2="http://schemas.microsoft.com/office/drawing/2015/10/21/chartex" xmlns:cx3="http://schemas.microsoft.com/office/drawing/2016/5/9/chartex" xmlns:cx4="http://schemas.microsoft.com/office/drawing/2016/5/10/chartex" xmlns:cx5="http://schemas.microsoft.com/office/drawing/2016/5/11/chartex" xmlns:cx6="http://schemas.microsoft.com/office/drawing/2016/5/12/chartex" xmlns:cx7="http://schemas.microsoft.com/office/drawing/2016/5/13/chartex" xmlns:cx8="http://schemas.microsoft.com/office/drawing/2016/5/14/chartex" xmlns:mc="http://schemas.openxmlformats.org/markup-compatibility/2006" xmlns:aink="http://schemas.microsoft.com/office/drawing/2016/ink" xmlns:am3d="http://schemas.microsoft.com/office/drawing/2017/model3d" xmlns:o="urn:schemas-microsoft-com:office:office" xmlns:oel="http://schemas.microsoft.com/office/2019/extlst" xmlns:r="http://schemas.openxmlformats.org/officeDocument/2006/relationships" xmlns:m="http://schemas.openxmlformats.org/officeDocument/2006/math" xmlns:v="urn:schemas-microsoft-com:vml" xmlns:wp14="http://schemas.microsoft.com/office/word/2010/wordprocessingDrawing" xmlns:wp="http://schemas.openxmlformats.org/drawingml/2006/wordprocessingDrawing" xmlns:w10="urn:schemas-microsoft-com:office:word" xmlns:w="http://schemas.openxmlformats.org/wordprocessingml/2006/main" xmlns:w14="http://schemas.microsoft.com/office/word/2010/wordml" xmlns:w15="http://schemas.microsoft.com/office/word/2012/wordml" xmlns:w16cex="http://schemas.microsoft.com/office/word/2018/wordml/cex" xmlns:w16cid="http://schemas.microsoft.com/office/word/2016/wordml/cid" xmlns:w16="http://schemas.microsoft.com/office/word/2018/wordml" xmlns:w16sdtdh="http://schemas.microsoft.com/office/word/2020/wordml/sdtdatahash" xmlns:w16se="http://schemas.microsoft.com/office/word/2015/wordml/symex" xmlns:wpg="http://schemas.microsoft.com/office/word/2010/wordprocessingGroup" xmlns:wpi="http://schemas.microsoft.com/office/word/2010/wordprocessingInk" xmlns:wne="http://schemas.microsoft.com/office/word/2006/wordml" xmlns:wps="http://schemas.microsoft.com/office/word/2010/wordprocessingShape" mc:Ignorable="w14 w15 w16se w16cid w16 w16cex w16sdtdh wp14">
+<w:endnotes xmlns:wpc="http://schemas.microsoft.com/office/word/2010/wordprocessingCanvas" xmlns:cx="http://schemas.microsoft.com/office/drawing/2014/chartex" xmlns:cx1="http://schemas.microsoft.com/office/drawing/2015/9/8/chartex" xmlns:cx2="http://schemas.microsoft.com/office/drawing/2015/10/21/chartex" xmlns:cx3="http://schemas.microsoft.com/office/drawing/2016/5/9/chartex" xmlns:cx4="http://schemas.microsoft.com/office/drawing/2016/5/10/chartex" xmlns:cx5="http://schemas.microsoft.com/office/drawing/2016/5/11/chartex" xmlns:cx6="http://schemas.microsoft.com/office/drawing/2016/5/12/chartex" xmlns:cx7="http://schemas.microsoft.com/office/drawing/2016/5/13/chartex" xmlns:cx8="http://schemas.microsoft.com/office/drawing/2016/5/14/chartex" xmlns:mc="http://schemas.openxmlformats.org/markup-compatibility/2006" xmlns:aink="http://schemas.microsoft.com/office/drawing/2016/ink" xmlns:am3d="http://schemas.microsoft.com/office/drawing/2017/model3d" xmlns:o="urn:schemas-microsoft-com:office:office" xmlns:oel="http://schemas.microsoft.com/office/2019/extlst" xmlns:r="http://schemas.openxmlformats.org/officeDocument/2006/relationships" xmlns:m="http://schemas.openxmlformats.org/officeDocument/2006/math" xmlns:v="urn:schemas-microsoft-com:vml" xmlns:wp14="http://schemas.microsoft.com/office/word/2010/wordprocessingDrawing" xmlns:wp="http://schemas.openxmlformats.org/drawingml/2006/wordprocessingDrawing" xmlns:w10="urn:schemas-microsoft-com:office:word" xmlns:w="http://schemas.openxmlformats.org/wordprocessingml/2006/main" xmlns:w14="http://schemas.microsoft.com/office/word/2010/wordml" xmlns:w15="http://schemas.microsoft.com/office/word/2012/wordml" xmlns:w16cex="http://schemas.microsoft.com/office/word/2018/wordml/cex" xmlns:w16cid="http://schemas.microsoft.com/office/word/2016/wordml/cid" xmlns:w16="http://schemas.microsoft.com/office/word/2018/wordml" xmlns:w16du="http://schemas.microsoft.com/office/word/2023/wordml/word16du" xmlns:w16sdtdh="http://schemas.microsoft.com/office/word/2020/wordml/sdtdatahash" xmlns:w16sdtfl="http://schemas.microsoft.com/office/word/2024/wordml/sdtformatlock" xmlns:w16se="http://schemas.microsoft.com/office/word/2015/wordml/symex" xmlns:wpg="http://schemas.microsoft.com/office/word/2010/wordprocessingGroup" xmlns:wpi="http://schemas.microsoft.com/office/word/2010/wordprocessingInk" xmlns:wne="http://schemas.microsoft.com/office/word/2006/wordml" xmlns:wps="http://schemas.microsoft.com/office/word/2010/wordprocessingShape" mc:Ignorable="w14 w15 w16se w16cid w16 w16cex w16sdtdh w16sdtfl w16du wp14">
   <w:endnote w:type="separator" w:id="-1">
     <w:p>
       <w:r>
@@ -1500,7 +1482,7 @@
 </file>
 
 <file path=word/footer1.xml><?xml version="1.0" encoding="utf-8"?>
-<w:ftr xmlns:wpc="http://schemas.microsoft.com/office/word/2010/wordprocessingCanvas" xmlns:cx="http://schemas.microsoft.com/office/drawing/2014/chartex" xmlns:cx1="http://schemas.microsoft.com/office/drawing/2015/9/8/chartex" xmlns:cx2="http://schemas.microsoft.com/office/drawing/2015/10/21/chartex" xmlns:cx3="http://schemas.microsoft.com/office/drawing/2016/5/9/chartex" xmlns:cx4="http://schemas.microsoft.com/office/drawing/2016/5/10/chartex" xmlns:cx5="http://schemas.microsoft.com/office/drawing/2016/5/11/chartex" xmlns:cx6="http://schemas.microsoft.com/office/drawing/2016/5/12/chartex" xmlns:cx7="http://schemas.microsoft.com/office/drawing/2016/5/13/chartex" xmlns:cx8="http://schemas.microsoft.com/office/drawing/2016/5/14/chartex" xmlns:mc="http://schemas.openxmlformats.org/markup-compatibility/2006" xmlns:aink="http://schemas.microsoft.com/office/drawing/2016/ink" xmlns:am3d="http://schemas.microsoft.com/office/drawing/2017/model3d" xmlns:o="urn:schemas-microsoft-com:office:office" xmlns:oel="http://schemas.microsoft.com/office/2019/extlst" xmlns:r="http://schemas.openxmlformats.org/officeDocument/2006/relationships" xmlns:m="http://schemas.openxmlformats.org/officeDocument/2006/math" xmlns:v="urn:schemas-microsoft-com:vml" xmlns:wp14="http://schemas.microsoft.com/office/word/2010/wordprocessingDrawing" xmlns:wp="http://schemas.openxmlformats.org/drawingml/2006/wordprocessingDrawing" xmlns:w10="urn:schemas-microsoft-com:office:word" xmlns:w="http://schemas.openxmlformats.org/wordprocessingml/2006/main" xmlns:w14="http://schemas.microsoft.com/office/word/2010/wordml" xmlns:w15="http://schemas.microsoft.com/office/word/2012/wordml" xmlns:w16cex="http://schemas.microsoft.com/office/word/2018/wordml/cex" xmlns:w16cid="http://schemas.microsoft.com/office/word/2016/wordml/cid" xmlns:w16="http://schemas.microsoft.com/office/word/2018/wordml" xmlns:w16sdtdh="http://schemas.microsoft.com/office/word/2020/wordml/sdtdatahash" xmlns:w16se="http://schemas.microsoft.com/office/word/2015/wordml/symex" xmlns:wpg="http://schemas.microsoft.com/office/word/2010/wordprocessingGroup" xmlns:wpi="http://schemas.microsoft.com/office/word/2010/wordprocessingInk" xmlns:wne="http://schemas.microsoft.com/office/word/2006/wordml" xmlns:wps="http://schemas.microsoft.com/office/word/2010/wordprocessingShape" mc:Ignorable="w14 w15 w16se w16cid w16 w16cex w16sdtdh wp14">
+<w:ftr xmlns:wpc="http://schemas.microsoft.com/office/word/2010/wordprocessingCanvas" xmlns:cx="http://schemas.microsoft.com/office/drawing/2014/chartex" xmlns:cx1="http://schemas.microsoft.com/office/drawing/2015/9/8/chartex" xmlns:cx2="http://schemas.microsoft.com/office/drawing/2015/10/21/chartex" xmlns:cx3="http://schemas.microsoft.com/office/drawing/2016/5/9/chartex" xmlns:cx4="http://schemas.microsoft.com/office/drawing/2016/5/10/chartex" xmlns:cx5="http://schemas.microsoft.com/office/drawing/2016/5/11/chartex" xmlns:cx6="http://schemas.microsoft.com/office/drawing/2016/5/12/chartex" xmlns:cx7="http://schemas.microsoft.com/office/drawing/2016/5/13/chartex" xmlns:cx8="http://schemas.microsoft.com/office/drawing/2016/5/14/chartex" xmlns:mc="http://schemas.openxmlformats.org/markup-compatibility/2006" xmlns:aink="http://schemas.microsoft.com/office/drawing/2016/ink" xmlns:am3d="http://schemas.microsoft.com/office/drawing/2017/model3d" xmlns:o="urn:schemas-microsoft-com:office:office" xmlns:oel="http://schemas.microsoft.com/office/2019/extlst" xmlns:r="http://schemas.openxmlformats.org/officeDocument/2006/relationships" xmlns:m="http://schemas.openxmlformats.org/officeDocument/2006/math" xmlns:v="urn:schemas-microsoft-com:vml" xmlns:wp14="http://schemas.microsoft.com/office/word/2010/wordprocessingDrawing" xmlns:wp="http://schemas.openxmlformats.org/drawingml/2006/wordprocessingDrawing" xmlns:w10="urn:schemas-microsoft-com:office:word" xmlns:w="http://schemas.openxmlformats.org/wordprocessingml/2006/main" xmlns:w14="http://schemas.microsoft.com/office/word/2010/wordml" xmlns:w15="http://schemas.microsoft.com/office/word/2012/wordml" xmlns:w16cex="http://schemas.microsoft.com/office/word/2018/wordml/cex" xmlns:w16cid="http://schemas.microsoft.com/office/word/2016/wordml/cid" xmlns:w16="http://schemas.microsoft.com/office/word/2018/wordml" xmlns:w16du="http://schemas.microsoft.com/office/word/2023/wordml/word16du" xmlns:w16sdtdh="http://schemas.microsoft.com/office/word/2020/wordml/sdtdatahash" xmlns:w16sdtfl="http://schemas.microsoft.com/office/word/2024/wordml/sdtformatlock" xmlns:w16se="http://schemas.microsoft.com/office/word/2015/wordml/symex" xmlns:wpg="http://schemas.microsoft.com/office/word/2010/wordprocessingGroup" xmlns:wpi="http://schemas.microsoft.com/office/word/2010/wordprocessingInk" xmlns:wne="http://schemas.microsoft.com/office/word/2006/wordml" xmlns:wps="http://schemas.microsoft.com/office/word/2010/wordprocessingShape" mc:Ignorable="w14 w15 w16se w16cid w16 w16cex w16sdtdh w16sdtfl w16du wp14">
   <w:p>
     <w:pPr>
       <w:pStyle w:val="Footer"/>
@@ -1510,7 +1492,7 @@
 </file>
 
 <file path=word/footer2.xml><?xml version="1.0" encoding="utf-8"?>
-<w:ftr xmlns:wpc="http://schemas.microsoft.com/office/word/2010/wordprocessingCanvas" xmlns:cx="http://schemas.microsoft.com/office/drawing/2014/chartex" xmlns:cx1="http://schemas.microsoft.com/office/drawing/2015/9/8/chartex" xmlns:cx2="http://schemas.microsoft.com/office/drawing/2015/10/21/chartex" xmlns:cx3="http://schemas.microsoft.com/office/drawing/2016/5/9/chartex" xmlns:cx4="http://schemas.microsoft.com/office/drawing/2016/5/10/chartex" xmlns:cx5="http://schemas.microsoft.com/office/drawing/2016/5/11/chartex" xmlns:cx6="http://schemas.microsoft.com/office/drawing/2016/5/12/chartex" xmlns:cx7="http://schemas.microsoft.com/office/drawing/2016/5/13/chartex" xmlns:cx8="http://schemas.microsoft.com/office/drawing/2016/5/14/chartex" xmlns:mc="http://schemas.openxmlformats.org/markup-compatibility/2006" xmlns:aink="http://schemas.microsoft.com/office/drawing/2016/ink" xmlns:am3d="http://schemas.microsoft.com/office/drawing/2017/model3d" xmlns:o="urn:schemas-microsoft-com:office:office" xmlns:oel="http://schemas.microsoft.com/office/2019/extlst" xmlns:r="http://schemas.openxmlformats.org/officeDocument/2006/relationships" xmlns:m="http://schemas.openxmlformats.org/officeDocument/2006/math" xmlns:v="urn:schemas-microsoft-com:vml" xmlns:wp14="http://schemas.microsoft.com/office/word/2010/wordprocessingDrawing" xmlns:wp="http://schemas.openxmlformats.org/drawingml/2006/wordprocessingDrawing" xmlns:w10="urn:schemas-microsoft-com:office:word" xmlns:w="http://schemas.openxmlformats.org/wordprocessingml/2006/main" xmlns:w14="http://schemas.microsoft.com/office/word/2010/wordml" xmlns:w15="http://schemas.microsoft.com/office/word/2012/wordml" xmlns:w16cex="http://schemas.microsoft.com/office/word/2018/wordml/cex" xmlns:w16cid="http://schemas.microsoft.com/office/word/2016/wordml/cid" xmlns:w16="http://schemas.microsoft.com/office/word/2018/wordml" xmlns:w16sdtdh="http://schemas.microsoft.com/office/word/2020/wordml/sdtdatahash" xmlns:w16se="http://schemas.microsoft.com/office/word/2015/wordml/symex" xmlns:wpg="http://schemas.microsoft.com/office/word/2010/wordprocessingGroup" xmlns:wpi="http://schemas.microsoft.com/office/word/2010/wordprocessingInk" xmlns:wne="http://schemas.microsoft.com/office/word/2006/wordml" xmlns:wps="http://schemas.microsoft.com/office/word/2010/wordprocessingShape" mc:Ignorable="w14 w15 w16se w16cid w16 w16cex w16sdtdh wp14">
+<w:ftr xmlns:wpc="http://schemas.microsoft.com/office/word/2010/wordprocessingCanvas" xmlns:cx="http://schemas.microsoft.com/office/drawing/2014/chartex" xmlns:cx1="http://schemas.microsoft.com/office/drawing/2015/9/8/chartex" xmlns:cx2="http://schemas.microsoft.com/office/drawing/2015/10/21/chartex" xmlns:cx3="http://schemas.microsoft.com/office/drawing/2016/5/9/chartex" xmlns:cx4="http://schemas.microsoft.com/office/drawing/2016/5/10/chartex" xmlns:cx5="http://schemas.microsoft.com/office/drawing/2016/5/11/chartex" xmlns:cx6="http://schemas.microsoft.com/office/drawing/2016/5/12/chartex" xmlns:cx7="http://schemas.microsoft.com/office/drawing/2016/5/13/chartex" xmlns:cx8="http://schemas.microsoft.com/office/drawing/2016/5/14/chartex" xmlns:mc="http://schemas.openxmlformats.org/markup-compatibility/2006" xmlns:aink="http://schemas.microsoft.com/office/drawing/2016/ink" xmlns:am3d="http://schemas.microsoft.com/office/drawing/2017/model3d" xmlns:o="urn:schemas-microsoft-com:office:office" xmlns:oel="http://schemas.microsoft.com/office/2019/extlst" xmlns:r="http://schemas.openxmlformats.org/officeDocument/2006/relationships" xmlns:m="http://schemas.openxmlformats.org/officeDocument/2006/math" xmlns:v="urn:schemas-microsoft-com:vml" xmlns:wp14="http://schemas.microsoft.com/office/word/2010/wordprocessingDrawing" xmlns:wp="http://schemas.openxmlformats.org/drawingml/2006/wordprocessingDrawing" xmlns:w10="urn:schemas-microsoft-com:office:word" xmlns:w="http://schemas.openxmlformats.org/wordprocessingml/2006/main" xmlns:w14="http://schemas.microsoft.com/office/word/2010/wordml" xmlns:w15="http://schemas.microsoft.com/office/word/2012/wordml" xmlns:w16cex="http://schemas.microsoft.com/office/word/2018/wordml/cex" xmlns:w16cid="http://schemas.microsoft.com/office/word/2016/wordml/cid" xmlns:w16="http://schemas.microsoft.com/office/word/2018/wordml" xmlns:w16du="http://schemas.microsoft.com/office/word/2023/wordml/word16du" xmlns:w16sdtdh="http://schemas.microsoft.com/office/word/2020/wordml/sdtdatahash" xmlns:w16sdtfl="http://schemas.microsoft.com/office/word/2024/wordml/sdtformatlock" xmlns:w16se="http://schemas.microsoft.com/office/word/2015/wordml/symex" xmlns:wpg="http://schemas.microsoft.com/office/word/2010/wordprocessingGroup" xmlns:wpi="http://schemas.microsoft.com/office/word/2010/wordprocessingInk" xmlns:wne="http://schemas.microsoft.com/office/word/2006/wordml" xmlns:wps="http://schemas.microsoft.com/office/word/2010/wordprocessingShape" mc:Ignorable="w14 w15 w16se w16cid w16 w16cex w16sdtdh w16sdtfl w16du wp14">
   <w:p>
     <w:pPr>
       <w:pStyle w:val="Footer"/>
@@ -1520,7 +1502,7 @@
 </file>
 
 <file path=word/footer3.xml><?xml version="1.0" encoding="utf-8"?>
-<w:ftr xmlns:wpc="http://schemas.microsoft.com/office/word/2010/wordprocessingCanvas" xmlns:cx="http://schemas.microsoft.com/office/drawing/2014/chartex" xmlns:cx1="http://schemas.microsoft.com/office/drawing/2015/9/8/chartex" xmlns:cx2="http://schemas.microsoft.com/office/drawing/2015/10/21/chartex" xmlns:cx3="http://schemas.microsoft.com/office/drawing/2016/5/9/chartex" xmlns:cx4="http://schemas.microsoft.com/office/drawing/2016/5/10/chartex" xmlns:cx5="http://schemas.microsoft.com/office/drawing/2016/5/11/chartex" xmlns:cx6="http://schemas.microsoft.com/office/drawing/2016/5/12/chartex" xmlns:cx7="http://schemas.microsoft.com/office/drawing/2016/5/13/chartex" xmlns:cx8="http://schemas.microsoft.com/office/drawing/2016/5/14/chartex" xmlns:mc="http://schemas.openxmlformats.org/markup-compatibility/2006" xmlns:aink="http://schemas.microsoft.com/office/drawing/2016/ink" xmlns:am3d="http://schemas.microsoft.com/office/drawing/2017/model3d" xmlns:o="urn:schemas-microsoft-com:office:office" xmlns:oel="http://schemas.microsoft.com/office/2019/extlst" xmlns:r="http://schemas.openxmlformats.org/officeDocument/2006/relationships" xmlns:m="http://schemas.openxmlformats.org/officeDocument/2006/math" xmlns:v="urn:schemas-microsoft-com:vml" xmlns:wp14="http://schemas.microsoft.com/office/word/2010/wordprocessingDrawing" xmlns:wp="http://schemas.openxmlformats.org/drawingml/2006/wordprocessingDrawing" xmlns:w10="urn:schemas-microsoft-com:office:word" xmlns:w="http://schemas.openxmlformats.org/wordprocessingml/2006/main" xmlns:w14="http://schemas.microsoft.com/office/word/2010/wordml" xmlns:w15="http://schemas.microsoft.com/office/word/2012/wordml" xmlns:w16cex="http://schemas.microsoft.com/office/word/2018/wordml/cex" xmlns:w16cid="http://schemas.microsoft.com/office/word/2016/wordml/cid" xmlns:w16="http://schemas.microsoft.com/office/word/2018/wordml" xmlns:w16sdtdh="http://schemas.microsoft.com/office/word/2020/wordml/sdtdatahash" xmlns:w16se="http://schemas.microsoft.com/office/word/2015/wordml/symex" xmlns:wpg="http://schemas.microsoft.com/office/word/2010/wordprocessingGroup" xmlns:wpi="http://schemas.microsoft.com/office/word/2010/wordprocessingInk" xmlns:wne="http://schemas.microsoft.com/office/word/2006/wordml" xmlns:wps="http://schemas.microsoft.com/office/word/2010/wordprocessingShape" mc:Ignorable="w14 w15 w16se w16cid w16 w16cex w16sdtdh wp14">
+<w:ftr xmlns:wpc="http://schemas.microsoft.com/office/word/2010/wordprocessingCanvas" xmlns:cx="http://schemas.microsoft.com/office/drawing/2014/chartex" xmlns:cx1="http://schemas.microsoft.com/office/drawing/2015/9/8/chartex" xmlns:cx2="http://schemas.microsoft.com/office/drawing/2015/10/21/chartex" xmlns:cx3="http://schemas.microsoft.com/office/drawing/2016/5/9/chartex" xmlns:cx4="http://schemas.microsoft.com/office/drawing/2016/5/10/chartex" xmlns:cx5="http://schemas.microsoft.com/office/drawing/2016/5/11/chartex" xmlns:cx6="http://schemas.microsoft.com/office/drawing/2016/5/12/chartex" xmlns:cx7="http://schemas.microsoft.com/office/drawing/2016/5/13/chartex" xmlns:cx8="http://schemas.microsoft.com/office/drawing/2016/5/14/chartex" xmlns:mc="http://schemas.openxmlformats.org/markup-compatibility/2006" xmlns:aink="http://schemas.microsoft.com/office/drawing/2016/ink" xmlns:am3d="http://schemas.microsoft.com/office/drawing/2017/model3d" xmlns:o="urn:schemas-microsoft-com:office:office" xmlns:oel="http://schemas.microsoft.com/office/2019/extlst" xmlns:r="http://schemas.openxmlformats.org/officeDocument/2006/relationships" xmlns:m="http://schemas.openxmlformats.org/officeDocument/2006/math" xmlns:v="urn:schemas-microsoft-com:vml" xmlns:wp14="http://schemas.microsoft.com/office/word/2010/wordprocessingDrawing" xmlns:wp="http://schemas.openxmlformats.org/drawingml/2006/wordprocessingDrawing" xmlns:w10="urn:schemas-microsoft-com:office:word" xmlns:w="http://schemas.openxmlformats.org/wordprocessingml/2006/main" xmlns:w14="http://schemas.microsoft.com/office/word/2010/wordml" xmlns:w15="http://schemas.microsoft.com/office/word/2012/wordml" xmlns:w16cex="http://schemas.microsoft.com/office/word/2018/wordml/cex" xmlns:w16cid="http://schemas.microsoft.com/office/word/2016/wordml/cid" xmlns:w16="http://schemas.microsoft.com/office/word/2018/wordml" xmlns:w16du="http://schemas.microsoft.com/office/word/2023/wordml/word16du" xmlns:w16sdtdh="http://schemas.microsoft.com/office/word/2020/wordml/sdtdatahash" xmlns:w16sdtfl="http://schemas.microsoft.com/office/word/2024/wordml/sdtformatlock" xmlns:w16se="http://schemas.microsoft.com/office/word/2015/wordml/symex" xmlns:wpg="http://schemas.microsoft.com/office/word/2010/wordprocessingGroup" xmlns:wpi="http://schemas.microsoft.com/office/word/2010/wordprocessingInk" xmlns:wne="http://schemas.microsoft.com/office/word/2006/wordml" xmlns:wps="http://schemas.microsoft.com/office/word/2010/wordprocessingShape" mc:Ignorable="w14 w15 w16se w16cid w16 w16cex w16sdtdh w16sdtfl w16du wp14">
   <w:p>
     <w:pPr>
       <w:pStyle w:val="Footer"/>
@@ -1530,7 +1512,7 @@
 </file>
 
 <file path=word/footnotes.xml><?xml version="1.0" encoding="utf-8"?>
-<w:footnotes xmlns:wpc="http://schemas.microsoft.com/office/word/2010/wordprocessingCanvas" xmlns:cx="http://schemas.microsoft.com/office/drawing/2014/chartex" xmlns:cx1="http://schemas.microsoft.com/office/drawing/2015/9/8/chartex" xmlns:cx2="http://schemas.microsoft.com/office/drawing/2015/10/21/chartex" xmlns:cx3="http://schemas.microsoft.com/office/drawing/2016/5/9/chartex" xmlns:cx4="http://schemas.microsoft.com/office/drawing/2016/5/10/chartex" xmlns:cx5="http://schemas.microsoft.com/office/drawing/2016/5/11/chartex" xmlns:cx6="http://schemas.microsoft.com/office/drawing/2016/5/12/chartex" xmlns:cx7="http://schemas.microsoft.com/office/drawing/2016/5/13/chartex" xmlns:cx8="http://schemas.microsoft.com/office/drawing/2016/5/14/chartex" xmlns:mc="http://schemas.openxmlformats.org/markup-compatibility/2006" xmlns:aink="http://schemas.microsoft.com/office/drawing/2016/ink" xmlns:am3d="http://schemas.microsoft.com/office/drawing/2017/model3d" xmlns:o="urn:schemas-microsoft-com:office:office" xmlns:oel="http://schemas.microsoft.com/office/2019/extlst" xmlns:r="http://schemas.openxmlformats.org/officeDocument/2006/relationships" xmlns:m="http://schemas.openxmlformats.org/officeDocument/2006/math" xmlns:v="urn:schemas-microsoft-com:vml" xmlns:wp14="http://schemas.microsoft.com/office/word/2010/wordprocessingDrawing" xmlns:wp="http://schemas.openxmlformats.org/drawingml/2006/wordprocessingDrawing" xmlns:w10="urn:schemas-microsoft-com:office:word" xmlns:w="http://schemas.openxmlformats.org/wordprocessingml/2006/main" xmlns:w14="http://schemas.microsoft.com/office/word/2010/wordml" xmlns:w15="http://schemas.microsoft.com/office/word/2012/wordml" xmlns:w16cex="http://schemas.microsoft.com/office/word/2018/wordml/cex" xmlns:w16cid="http://schemas.microsoft.com/office/word/2016/wordml/cid" xmlns:w16="http://schemas.microsoft.com/office/word/2018/wordml" xmlns:w16sdtdh="http://schemas.microsoft.com/office/word/2020/wordml/sdtdatahash" xmlns:w16se="http://schemas.microsoft.com/office/word/2015/wordml/symex" xmlns:wpg="http://schemas.microsoft.com/office/word/2010/wordprocessingGroup" xmlns:wpi="http://schemas.microsoft.com/office/word/2010/wordprocessingInk" xmlns:wne="http://schemas.microsoft.com/office/word/2006/wordml" xmlns:wps="http://schemas.microsoft.com/office/word/2010/wordprocessingShape" mc:Ignorable="w14 w15 w16se w16cid w16 w16cex w16sdtdh wp14">
+<w:footnotes xmlns:wpc="http://schemas.microsoft.com/office/word/2010/wordprocessingCanvas" xmlns:cx="http://schemas.microsoft.com/office/drawing/2014/chartex" xmlns:cx1="http://schemas.microsoft.com/office/drawing/2015/9/8/chartex" xmlns:cx2="http://schemas.microsoft.com/office/drawing/2015/10/21/chartex" xmlns:cx3="http://schemas.microsoft.com/office/drawing/2016/5/9/chartex" xmlns:cx4="http://schemas.microsoft.com/office/drawing/2016/5/10/chartex" xmlns:cx5="http://schemas.microsoft.com/office/drawing/2016/5/11/chartex" xmlns:cx6="http://schemas.microsoft.com/office/drawing/2016/5/12/chartex" xmlns:cx7="http://schemas.microsoft.com/office/drawing/2016/5/13/chartex" xmlns:cx8="http://schemas.microsoft.com/office/drawing/2016/5/14/chartex" xmlns:mc="http://schemas.openxmlformats.org/markup-compatibility/2006" xmlns:aink="http://schemas.microsoft.com/office/drawing/2016/ink" xmlns:am3d="http://schemas.microsoft.com/office/drawing/2017/model3d" xmlns:o="urn:schemas-microsoft-com:office:office" xmlns:oel="http://schemas.microsoft.com/office/2019/extlst" xmlns:r="http://schemas.openxmlformats.org/officeDocument/2006/relationships" xmlns:m="http://schemas.openxmlformats.org/officeDocument/2006/math" xmlns:v="urn:schemas-microsoft-com:vml" xmlns:wp14="http://schemas.microsoft.com/office/word/2010/wordprocessingDrawing" xmlns:wp="http://schemas.openxmlformats.org/drawingml/2006/wordprocessingDrawing" xmlns:w10="urn:schemas-microsoft-com:office:word" xmlns:w="http://schemas.openxmlformats.org/wordprocessingml/2006/main" xmlns:w14="http://schemas.microsoft.com/office/word/2010/wordml" xmlns:w15="http://schemas.microsoft.com/office/word/2012/wordml" xmlns:w16cex="http://schemas.microsoft.com/office/word/2018/wordml/cex" xmlns:w16cid="http://schemas.microsoft.com/office/word/2016/wordml/cid" xmlns:w16="http://schemas.microsoft.com/office/word/2018/wordml" xmlns:w16du="http://schemas.microsoft.com/office/word/2023/wordml/word16du" xmlns:w16sdtdh="http://schemas.microsoft.com/office/word/2020/wordml/sdtdatahash" xmlns:w16sdtfl="http://schemas.microsoft.com/office/word/2024/wordml/sdtformatlock" xmlns:w16se="http://schemas.microsoft.com/office/word/2015/wordml/symex" xmlns:wpg="http://schemas.microsoft.com/office/word/2010/wordprocessingGroup" xmlns:wpi="http://schemas.microsoft.com/office/word/2010/wordprocessingInk" xmlns:wne="http://schemas.microsoft.com/office/word/2006/wordml" xmlns:wps="http://schemas.microsoft.com/office/word/2010/wordprocessingShape" mc:Ignorable="w14 w15 w16se w16cid w16 w16cex w16sdtdh w16sdtfl w16du wp14">
   <w:footnote w:type="separator" w:id="-1">
     <w:p>
       <w:r>
@@ -1549,7 +1531,7 @@
 </file>
 
 <file path=word/header1.xml><?xml version="1.0" encoding="utf-8"?>
-<w:hdr xmlns:wpc="http://schemas.microsoft.com/office/word/2010/wordprocessingCanvas" xmlns:cx="http://schemas.microsoft.com/office/drawing/2014/chartex" xmlns:cx1="http://schemas.microsoft.com/office/drawing/2015/9/8/chartex" xmlns:cx2="http://schemas.microsoft.com/office/drawing/2015/10/21/chartex" xmlns:cx3="http://schemas.microsoft.com/office/drawing/2016/5/9/chartex" xmlns:cx4="http://schemas.microsoft.com/office/drawing/2016/5/10/chartex" xmlns:cx5="http://schemas.microsoft.com/office/drawing/2016/5/11/chartex" xmlns:cx6="http://schemas.microsoft.com/office/drawing/2016/5/12/chartex" xmlns:cx7="http://schemas.microsoft.com/office/drawing/2016/5/13/chartex" xmlns:cx8="http://schemas.microsoft.com/office/drawing/2016/5/14/chartex" xmlns:mc="http://schemas.openxmlformats.org/markup-compatibility/2006" xmlns:aink="http://schemas.microsoft.com/office/drawing/2016/ink" xmlns:am3d="http://schemas.microsoft.com/office/drawing/2017/model3d" xmlns:o="urn:schemas-microsoft-com:office:office" xmlns:oel="http://schemas.microsoft.com/office/2019/extlst" xmlns:r="http://schemas.openxmlformats.org/officeDocument/2006/relationships" xmlns:m="http://schemas.openxmlformats.org/officeDocument/2006/math" xmlns:v="urn:schemas-microsoft-com:vml" xmlns:wp14="http://schemas.microsoft.com/office/word/2010/wordprocessingDrawing" xmlns:wp="http://schemas.openxmlformats.org/drawingml/2006/wordprocessingDrawing" xmlns:w10="urn:schemas-microsoft-com:office:word" xmlns:w="http://schemas.openxmlformats.org/wordprocessingml/2006/main" xmlns:w14="http://schemas.microsoft.com/office/word/2010/wordml" xmlns:w15="http://schemas.microsoft.com/office/word/2012/wordml" xmlns:w16cex="http://schemas.microsoft.com/office/word/2018/wordml/cex" xmlns:w16cid="http://schemas.microsoft.com/office/word/2016/wordml/cid" xmlns:w16="http://schemas.microsoft.com/office/word/2018/wordml" xmlns:w16sdtdh="http://schemas.microsoft.com/office/word/2020/wordml/sdtdatahash" xmlns:w16se="http://schemas.microsoft.com/office/word/2015/wordml/symex" xmlns:wpg="http://schemas.microsoft.com/office/word/2010/wordprocessingGroup" xmlns:wpi="http://schemas.microsoft.com/office/word/2010/wordprocessingInk" xmlns:wne="http://schemas.microsoft.com/office/word/2006/wordml" xmlns:wps="http://schemas.microsoft.com/office/word/2010/wordprocessingShape" mc:Ignorable="w14 w15 w16se w16cid w16 w16cex w16sdtdh wp14">
+<w:hdr xmlns:wpc="http://schemas.microsoft.com/office/word/2010/wordprocessingCanvas" xmlns:cx="http://schemas.microsoft.com/office/drawing/2014/chartex" xmlns:cx1="http://schemas.microsoft.com/office/drawing/2015/9/8/chartex" xmlns:cx2="http://schemas.microsoft.com/office/drawing/2015/10/21/chartex" xmlns:cx3="http://schemas.microsoft.com/office/drawing/2016/5/9/chartex" xmlns:cx4="http://schemas.microsoft.com/office/drawing/2016/5/10/chartex" xmlns:cx5="http://schemas.microsoft.com/office/drawing/2016/5/11/chartex" xmlns:cx6="http://schemas.microsoft.com/office/drawing/2016/5/12/chartex" xmlns:cx7="http://schemas.microsoft.com/office/drawing/2016/5/13/chartex" xmlns:cx8="http://schemas.microsoft.com/office/drawing/2016/5/14/chartex" xmlns:mc="http://schemas.openxmlformats.org/markup-compatibility/2006" xmlns:aink="http://schemas.microsoft.com/office/drawing/2016/ink" xmlns:am3d="http://schemas.microsoft.com/office/drawing/2017/model3d" xmlns:o="urn:schemas-microsoft-com:office:office" xmlns:oel="http://schemas.microsoft.com/office/2019/extlst" xmlns:r="http://schemas.openxmlformats.org/officeDocument/2006/relationships" xmlns:m="http://schemas.openxmlformats.org/officeDocument/2006/math" xmlns:v="urn:schemas-microsoft-com:vml" xmlns:wp14="http://schemas.microsoft.com/office/word/2010/wordprocessingDrawing" xmlns:wp="http://schemas.openxmlformats.org/drawingml/2006/wordprocessingDrawing" xmlns:w10="urn:schemas-microsoft-com:office:word" xmlns:w="http://schemas.openxmlformats.org/wordprocessingml/2006/main" xmlns:w14="http://schemas.microsoft.com/office/word/2010/wordml" xmlns:w15="http://schemas.microsoft.com/office/word/2012/wordml" xmlns:w16cex="http://schemas.microsoft.com/office/word/2018/wordml/cex" xmlns:w16cid="http://schemas.microsoft.com/office/word/2016/wordml/cid" xmlns:w16="http://schemas.microsoft.com/office/word/2018/wordml" xmlns:w16du="http://schemas.microsoft.com/office/word/2023/wordml/word16du" xmlns:w16sdtdh="http://schemas.microsoft.com/office/word/2020/wordml/sdtdatahash" xmlns:w16sdtfl="http://schemas.microsoft.com/office/word/2024/wordml/sdtformatlock" xmlns:w16se="http://schemas.microsoft.com/office/word/2015/wordml/symex" xmlns:wpg="http://schemas.microsoft.com/office/word/2010/wordprocessingGroup" xmlns:wpi="http://schemas.microsoft.com/office/word/2010/wordprocessingInk" xmlns:wne="http://schemas.microsoft.com/office/word/2006/wordml" xmlns:wps="http://schemas.microsoft.com/office/word/2010/wordprocessingShape" mc:Ignorable="w14 w15 w16se w16cid w16 w16cex w16sdtdh w16sdtfl w16du wp14">
   <w:p>
     <w:pPr>
       <w:pStyle w:val="Header"/>
@@ -1559,7 +1541,7 @@
 </file>
 
 <file path=word/header2.xml><?xml version="1.0" encoding="utf-8"?>
-<w:hdr xmlns:wpc="http://schemas.microsoft.com/office/word/2010/wordprocessingCanvas" xmlns:cx="http://schemas.microsoft.com/office/drawing/2014/chartex" xmlns:cx1="http://schemas.microsoft.com/office/drawing/2015/9/8/chartex" xmlns:cx2="http://schemas.microsoft.com/office/drawing/2015/10/21/chartex" xmlns:cx3="http://schemas.microsoft.com/office/drawing/2016/5/9/chartex" xmlns:cx4="http://schemas.microsoft.com/office/drawing/2016/5/10/chartex" xmlns:cx5="http://schemas.microsoft.com/office/drawing/2016/5/11/chartex" xmlns:cx6="http://schemas.microsoft.com/office/drawing/2016/5/12/chartex" xmlns:cx7="http://schemas.microsoft.com/office/drawing/2016/5/13/chartex" xmlns:cx8="http://schemas.microsoft.com/office/drawing/2016/5/14/chartex" xmlns:mc="http://schemas.openxmlformats.org/markup-compatibility/2006" xmlns:aink="http://schemas.microsoft.com/office/drawing/2016/ink" xmlns:am3d="http://schemas.microsoft.com/office/drawing/2017/model3d" xmlns:o="urn:schemas-microsoft-com:office:office" xmlns:oel="http://schemas.microsoft.com/office/2019/extlst" xmlns:r="http://schemas.openxmlformats.org/officeDocument/2006/relationships" xmlns:m="http://schemas.openxmlformats.org/officeDocument/2006/math" xmlns:v="urn:schemas-microsoft-com:vml" xmlns:wp14="http://schemas.microsoft.com/office/word/2010/wordprocessingDrawing" xmlns:wp="http://schemas.openxmlformats.org/drawingml/2006/wordprocessingDrawing" xmlns:w10="urn:schemas-microsoft-com:office:word" xmlns:w="http://schemas.openxmlformats.org/wordprocessingml/2006/main" xmlns:w14="http://schemas.microsoft.com/office/word/2010/wordml" xmlns:w15="http://schemas.microsoft.com/office/word/2012/wordml" xmlns:w16cex="http://schemas.microsoft.com/office/word/2018/wordml/cex" xmlns:w16cid="http://schemas.microsoft.com/office/word/2016/wordml/cid" xmlns:w16="http://schemas.microsoft.com/office/word/2018/wordml" xmlns:w16sdtdh="http://schemas.microsoft.com/office/word/2020/wordml/sdtdatahash" xmlns:w16se="http://schemas.microsoft.com/office/word/2015/wordml/symex" xmlns:wpg="http://schemas.microsoft.com/office/word/2010/wordprocessingGroup" xmlns:wpi="http://schemas.microsoft.com/office/word/2010/wordprocessingInk" xmlns:wne="http://schemas.microsoft.com/office/word/2006/wordml" xmlns:wps="http://schemas.microsoft.com/office/word/2010/wordprocessingShape" mc:Ignorable="w14 w15 w16se w16cid w16 w16cex w16sdtdh wp14">
+<w:hdr xmlns:wpc="http://schemas.microsoft.com/office/word/2010/wordprocessingCanvas" xmlns:cx="http://schemas.microsoft.com/office/drawing/2014/chartex" xmlns:cx1="http://schemas.microsoft.com/office/drawing/2015/9/8/chartex" xmlns:cx2="http://schemas.microsoft.com/office/drawing/2015/10/21/chartex" xmlns:cx3="http://schemas.microsoft.com/office/drawing/2016/5/9/chartex" xmlns:cx4="http://schemas.microsoft.com/office/drawing/2016/5/10/chartex" xmlns:cx5="http://schemas.microsoft.com/office/drawing/2016/5/11/chartex" xmlns:cx6="http://schemas.microsoft.com/office/drawing/2016/5/12/chartex" xmlns:cx7="http://schemas.microsoft.com/office/drawing/2016/5/13/chartex" xmlns:cx8="http://schemas.microsoft.com/office/drawing/2016/5/14/chartex" xmlns:mc="http://schemas.openxmlformats.org/markup-compatibility/2006" xmlns:aink="http://schemas.microsoft.com/office/drawing/2016/ink" xmlns:am3d="http://schemas.microsoft.com/office/drawing/2017/model3d" xmlns:o="urn:schemas-microsoft-com:office:office" xmlns:oel="http://schemas.microsoft.com/office/2019/extlst" xmlns:r="http://schemas.openxmlformats.org/officeDocument/2006/relationships" xmlns:m="http://schemas.openxmlformats.org/officeDocument/2006/math" xmlns:v="urn:schemas-microsoft-com:vml" xmlns:wp14="http://schemas.microsoft.com/office/word/2010/wordprocessingDrawing" xmlns:wp="http://schemas.openxmlformats.org/drawingml/2006/wordprocessingDrawing" xmlns:w10="urn:schemas-microsoft-com:office:word" xmlns:w="http://schemas.openxmlformats.org/wordprocessingml/2006/main" xmlns:w14="http://schemas.microsoft.com/office/word/2010/wordml" xmlns:w15="http://schemas.microsoft.com/office/word/2012/wordml" xmlns:w16cex="http://schemas.microsoft.com/office/word/2018/wordml/cex" xmlns:w16cid="http://schemas.microsoft.com/office/word/2016/wordml/cid" xmlns:w16="http://schemas.microsoft.com/office/word/2018/wordml" xmlns:w16du="http://schemas.microsoft.com/office/word/2023/wordml/word16du" xmlns:w16sdtdh="http://schemas.microsoft.com/office/word/2020/wordml/sdtdatahash" xmlns:w16sdtfl="http://schemas.microsoft.com/office/word/2024/wordml/sdtformatlock" xmlns:w16se="http://schemas.microsoft.com/office/word/2015/wordml/symex" xmlns:wpg="http://schemas.microsoft.com/office/word/2010/wordprocessingGroup" xmlns:wpi="http://schemas.microsoft.com/office/word/2010/wordprocessingInk" xmlns:wne="http://schemas.microsoft.com/office/word/2006/wordml" xmlns:wps="http://schemas.microsoft.com/office/word/2010/wordprocessingShape" mc:Ignorable="w14 w15 w16se w16cid w16 w16cex w16sdtdh w16sdtfl w16du wp14">
   <w:p>
     <w:pPr>
       <w:pStyle w:val="Header"/>
@@ -1569,7 +1551,7 @@
 </file>
 
 <file path=word/header3.xml><?xml version="1.0" encoding="utf-8"?>
-<w:hdr xmlns:wpc="http://schemas.microsoft.com/office/word/2010/wordprocessingCanvas" xmlns:cx="http://schemas.microsoft.com/office/drawing/2014/chartex" xmlns:cx1="http://schemas.microsoft.com/office/drawing/2015/9/8/chartex" xmlns:cx2="http://schemas.microsoft.com/office/drawing/2015/10/21/chartex" xmlns:cx3="http://schemas.microsoft.com/office/drawing/2016/5/9/chartex" xmlns:cx4="http://schemas.microsoft.com/office/drawing/2016/5/10/chartex" xmlns:cx5="http://schemas.microsoft.com/office/drawing/2016/5/11/chartex" xmlns:cx6="http://schemas.microsoft.com/office/drawing/2016/5/12/chartex" xmlns:cx7="http://schemas.microsoft.com/office/drawing/2016/5/13/chartex" xmlns:cx8="http://schemas.microsoft.com/office/drawing/2016/5/14/chartex" xmlns:mc="http://schemas.openxmlformats.org/markup-compatibility/2006" xmlns:aink="http://schemas.microsoft.com/office/drawing/2016/ink" xmlns:am3d="http://schemas.microsoft.com/office/drawing/2017/model3d" xmlns:o="urn:schemas-microsoft-com:office:office" xmlns:oel="http://schemas.microsoft.com/office/2019/extlst" xmlns:r="http://schemas.openxmlformats.org/officeDocument/2006/relationships" xmlns:m="http://schemas.openxmlformats.org/officeDocument/2006/math" xmlns:v="urn:schemas-microsoft-com:vml" xmlns:wp14="http://schemas.microsoft.com/office/word/2010/wordprocessingDrawing" xmlns:wp="http://schemas.openxmlformats.org/drawingml/2006/wordprocessingDrawing" xmlns:w10="urn:schemas-microsoft-com:office:word" xmlns:w="http://schemas.openxmlformats.org/wordprocessingml/2006/main" xmlns:w14="http://schemas.microsoft.com/office/word/2010/wordml" xmlns:w15="http://schemas.microsoft.com/office/word/2012/wordml" xmlns:w16cex="http://schemas.microsoft.com/office/word/2018/wordml/cex" xmlns:w16cid="http://schemas.microsoft.com/office/word/2016/wordml/cid" xmlns:w16="http://schemas.microsoft.com/office/word/2018/wordml" xmlns:w16sdtdh="http://schemas.microsoft.com/office/word/2020/wordml/sdtdatahash" xmlns:w16se="http://schemas.microsoft.com/office/word/2015/wordml/symex" xmlns:wpg="http://schemas.microsoft.com/office/word/2010/wordprocessingGroup" xmlns:wpi="http://schemas.microsoft.com/office/word/2010/wordprocessingInk" xmlns:wne="http://schemas.microsoft.com/office/word/2006/wordml" xmlns:wps="http://schemas.microsoft.com/office/word/2010/wordprocessingShape" mc:Ignorable="w14 w15 w16se w16cid w16 w16cex w16sdtdh wp14">
+<w:hdr xmlns:wpc="http://schemas.microsoft.com/office/word/2010/wordprocessingCanvas" xmlns:cx="http://schemas.microsoft.com/office/drawing/2014/chartex" xmlns:cx1="http://schemas.microsoft.com/office/drawing/2015/9/8/chartex" xmlns:cx2="http://schemas.microsoft.com/office/drawing/2015/10/21/chartex" xmlns:cx3="http://schemas.microsoft.com/office/drawing/2016/5/9/chartex" xmlns:cx4="http://schemas.microsoft.com/office/drawing/2016/5/10/chartex" xmlns:cx5="http://schemas.microsoft.com/office/drawing/2016/5/11/chartex" xmlns:cx6="http://schemas.microsoft.com/office/drawing/2016/5/12/chartex" xmlns:cx7="http://schemas.microsoft.com/office/drawing/2016/5/13/chartex" xmlns:cx8="http://schemas.microsoft.com/office/drawing/2016/5/14/chartex" xmlns:mc="http://schemas.openxmlformats.org/markup-compatibility/2006" xmlns:aink="http://schemas.microsoft.com/office/drawing/2016/ink" xmlns:am3d="http://schemas.microsoft.com/office/drawing/2017/model3d" xmlns:o="urn:schemas-microsoft-com:office:office" xmlns:oel="http://schemas.microsoft.com/office/2019/extlst" xmlns:r="http://schemas.openxmlformats.org/officeDocument/2006/relationships" xmlns:m="http://schemas.openxmlformats.org/officeDocument/2006/math" xmlns:v="urn:schemas-microsoft-com:vml" xmlns:wp14="http://schemas.microsoft.com/office/word/2010/wordprocessingDrawing" xmlns:wp="http://schemas.openxmlformats.org/drawingml/2006/wordprocessingDrawing" xmlns:w10="urn:schemas-microsoft-com:office:word" xmlns:w="http://schemas.openxmlformats.org/wordprocessingml/2006/main" xmlns:w14="http://schemas.microsoft.com/office/word/2010/wordml" xmlns:w15="http://schemas.microsoft.com/office/word/2012/wordml" xmlns:w16cex="http://schemas.microsoft.com/office/word/2018/wordml/cex" xmlns:w16cid="http://schemas.microsoft.com/office/word/2016/wordml/cid" xmlns:w16="http://schemas.microsoft.com/office/word/2018/wordml" xmlns:w16du="http://schemas.microsoft.com/office/word/2023/wordml/word16du" xmlns:w16sdtdh="http://schemas.microsoft.com/office/word/2020/wordml/sdtdatahash" xmlns:w16sdtfl="http://schemas.microsoft.com/office/word/2024/wordml/sdtformatlock" xmlns:w16se="http://schemas.microsoft.com/office/word/2015/wordml/symex" xmlns:wpg="http://schemas.microsoft.com/office/word/2010/wordprocessingGroup" xmlns:wpi="http://schemas.microsoft.com/office/word/2010/wordprocessingInk" xmlns:wne="http://schemas.microsoft.com/office/word/2006/wordml" xmlns:wps="http://schemas.microsoft.com/office/word/2010/wordprocessingShape" mc:Ignorable="w14 w15 w16se w16cid w16 w16cex w16sdtdh w16sdtfl w16du wp14">
   <w:p>
     <w:pPr>
       <w:pStyle w:val="Header"/>
@@ -1579,7 +1561,7 @@
 </file>
 
 <file path=word/styles.xml><?xml version="1.0" encoding="utf-8"?>
-<w:styles xmlns:mc="http://schemas.openxmlformats.org/markup-compatibility/2006" xmlns:r="http://schemas.openxmlformats.org/officeDocument/2006/relationships" xmlns:w="http://schemas.openxmlformats.org/wordprocessingml/2006/main" xmlns:w14="http://schemas.microsoft.com/office/word/2010/wordml" xmlns:w15="http://schemas.microsoft.com/office/word/2012/wordml" xmlns:w16cex="http://schemas.microsoft.com/office/word/2018/wordml/cex" xmlns:w16cid="http://schemas.microsoft.com/office/word/2016/wordml/cid" xmlns:w16="http://schemas.microsoft.com/office/word/2018/wordml" xmlns:w16sdtdh="http://schemas.microsoft.com/office/word/2020/wordml/sdtdatahash" xmlns:w16se="http://schemas.microsoft.com/office/word/2015/wordml/symex" mc:Ignorable="w14 w15 w16se w16cid w16 w16cex w16sdtdh">
+<w:styles xmlns:mc="http://schemas.openxmlformats.org/markup-compatibility/2006" xmlns:r="http://schemas.openxmlformats.org/officeDocument/2006/relationships" xmlns:w="http://schemas.openxmlformats.org/wordprocessingml/2006/main" xmlns:w14="http://schemas.microsoft.com/office/word/2010/wordml" xmlns:w15="http://schemas.microsoft.com/office/word/2012/wordml" xmlns:w16cex="http://schemas.microsoft.com/office/word/2018/wordml/cex" xmlns:w16cid="http://schemas.microsoft.com/office/word/2016/wordml/cid" xmlns:w16="http://schemas.microsoft.com/office/word/2018/wordml" xmlns:w16du="http://schemas.microsoft.com/office/word/2023/wordml/word16du" xmlns:w16sdtdh="http://schemas.microsoft.com/office/word/2020/wordml/sdtdatahash" xmlns:w16sdtfl="http://schemas.microsoft.com/office/word/2024/wordml/sdtformatlock" xmlns:w16se="http://schemas.microsoft.com/office/word/2015/wordml/symex" mc:Ignorable="w14 w15 w16se w16cid w16 w16cex w16sdtdh w16sdtfl w16du">
   <w:docDefaults>
     <w:rPrDefault>
       <w:rPr>
@@ -2176,7 +2158,6 @@
   <w:style w:type="character" w:default="1" w:styleId="DefaultParagraphFont">
     <w:name w:val="Default Paragraph Font"/>
     <w:uiPriority w:val="1"/>
-    <w:semiHidden/>
     <w:unhideWhenUsed/>
   </w:style>
   <w:style w:type="table" w:default="1" w:styleId="TableNormal">
@@ -2878,14 +2859,6 @@
 </file>
 
 <file path=customXml/item1.xml><?xml version="1.0" encoding="utf-8"?>
-<p:properties xmlns:p="http://schemas.microsoft.com/office/2006/metadata/properties" xmlns:xsi="http://www.w3.org/2001/XMLSchema-instance" xmlns:pc="http://schemas.microsoft.com/office/infopath/2007/PartnerControls">
-  <documentManagement>
-    <_activity xmlns="3e0b66e7-9e22-40b1-9aad-4f6aaf5eeee5" xsi:nil="true"/>
-  </documentManagement>
-</p:properties>
-</file>
-
-<file path=customXml/item2.xml><?xml version="1.0" encoding="utf-8"?>
 <ct:contentTypeSchema xmlns:ct="http://schemas.microsoft.com/office/2006/metadata/contentType" xmlns:ma="http://schemas.microsoft.com/office/2006/metadata/properties/metaAttributes" ct:_="" ma:_="" ma:contentTypeName="Document" ma:contentTypeID="0x01010091E78E840193D041A49D1070409B9424" ma:contentTypeVersion="6" ma:contentTypeDescription="Create a new document." ma:contentTypeScope="" ma:versionID="9a01138e44f47428ffbb9e901a22b09f">
   <xsd:schema xmlns:xsd="http://www.w3.org/2001/XMLSchema" xmlns:xs="http://www.w3.org/2001/XMLSchema" xmlns:p="http://schemas.microsoft.com/office/2006/metadata/properties" xmlns:ns3="3e0b66e7-9e22-40b1-9aad-4f6aaf5eeee5" targetNamespace="http://schemas.microsoft.com/office/2006/metadata/properties" ma:root="true" ma:fieldsID="2a2a66f11ac6698d2c0d6851c47ab3af" ns3:_="">
     <xsd:import namespace="3e0b66e7-9e22-40b1-9aad-4f6aaf5eeee5"/>
@@ -3041,6 +3014,14 @@
 </ct:contentTypeSchema>
 </file>
 
+<file path=customXml/item2.xml><?xml version="1.0" encoding="utf-8"?>
+<p:properties xmlns:p="http://schemas.microsoft.com/office/2006/metadata/properties" xmlns:xsi="http://www.w3.org/2001/XMLSchema-instance" xmlns:pc="http://schemas.microsoft.com/office/infopath/2007/PartnerControls">
+  <documentManagement>
+    <_activity xmlns="3e0b66e7-9e22-40b1-9aad-4f6aaf5eeee5" xsi:nil="true"/>
+  </documentManagement>
+</p:properties>
+</file>
+
 <file path=customXml/item3.xml><?xml version="1.0" encoding="utf-8"?>
 <?mso-contentType ?>
 <FormTemplates xmlns="http://schemas.microsoft.com/sharepoint/v3/contenttype/forms">
@@ -3051,16 +3032,6 @@
 </file>
 
 <file path=customXml/itemProps1.xml><?xml version="1.0" encoding="utf-8"?>
-<ds:datastoreItem xmlns:ds="http://schemas.openxmlformats.org/officeDocument/2006/customXml" ds:itemID="{AF5C1FDD-B9F2-40B6-9774-9C2373D89C3E}">
-  <ds:schemaRefs>
-    <ds:schemaRef ds:uri="http://schemas.microsoft.com/office/2006/metadata/properties"/>
-    <ds:schemaRef ds:uri="http://schemas.microsoft.com/office/infopath/2007/PartnerControls"/>
-    <ds:schemaRef ds:uri="3e0b66e7-9e22-40b1-9aad-4f6aaf5eeee5"/>
-  </ds:schemaRefs>
-</ds:datastoreItem>
-</file>
-
-<file path=customXml/itemProps2.xml><?xml version="1.0" encoding="utf-8"?>
 <ds:datastoreItem xmlns:ds="http://schemas.openxmlformats.org/officeDocument/2006/customXml" ds:itemID="{79FBC7B2-E9AC-4AD0-B258-25DD6A58C588}">
   <ds:schemaRefs>
     <ds:schemaRef ds:uri="http://schemas.microsoft.com/office/2006/metadata/contentType"/>
@@ -3078,6 +3049,16 @@
 </ds:datastoreItem>
 </file>
 
+<file path=customXml/itemProps2.xml><?xml version="1.0" encoding="utf-8"?>
+<ds:datastoreItem xmlns:ds="http://schemas.openxmlformats.org/officeDocument/2006/customXml" ds:itemID="{AF5C1FDD-B9F2-40B6-9774-9C2373D89C3E}">
+  <ds:schemaRefs>
+    <ds:schemaRef ds:uri="http://schemas.microsoft.com/office/2006/metadata/properties"/>
+    <ds:schemaRef ds:uri="http://schemas.microsoft.com/office/infopath/2007/PartnerControls"/>
+    <ds:schemaRef ds:uri="3e0b66e7-9e22-40b1-9aad-4f6aaf5eeee5"/>
+  </ds:schemaRefs>
+</ds:datastoreItem>
+</file>
+
 <file path=customXml/itemProps3.xml><?xml version="1.0" encoding="utf-8"?>
 <ds:datastoreItem xmlns:ds="http://schemas.openxmlformats.org/officeDocument/2006/customXml" ds:itemID="{051E889D-1E23-4B99-9CEE-4F28C0D75924}">
   <ds:schemaRefs>

</xml_diff>